<commit_message>
Add scripts for analyzing documents and generating Gantt chart
- Created `analyze_yesa_docs.py` to extract text from a PDF and a DOCX file, handling potential errors during the process.
- Developed `generate_yesa_gantt.py` to create a Gantt chart in Excel, detailing project activities, timelines, and statuses with visual progress indicators.
</commit_message>
<xml_diff>
--- a/Docs/documentacion final/Manuales de usuario/Manual_Usuario_YESA_Administrador.docx
+++ b/Docs/documentacion final/Manuales de usuario/Manual_Usuario_YESA_Administrador.docx
@@ -364,7 +364,7 @@
         <w:pStyle w:val="ListBullet"/>
       </w:pPr>
       <w:r>
-        <w:t>Módulo administrativo: menú de administración con accesos a Dashboard, Categorías, Subcategorías, Productos, Pedidos, Usuarios y Cotizaciones según el rol.</w:t>
+        <w:t>Módulo administrativo: menú de administración con accesos a Dashboard, Categorías, Subcategorías, Productos, Pedidos y Soporte para auxiliares, y además Usuarios y Cotizaciones para administradores.</w:t>
       </w:r>
     </w:p>
     <w:p>
@@ -548,7 +548,7 @@
         <w:pStyle w:val="ListBullet"/>
       </w:pPr>
       <w:r>
-        <w:t>Los auxiliares y administradores ven el menú 'Administración' con accesos a Dashboard, Categorías, Subcategorías, Productos y Pedidos.</w:t>
+        <w:t>Los auxiliares ven el menú 'Administración' con accesos a Dashboard, Pedidos, Categorías, Subcategorías, Productos y Soporte, con permisos limitados.</w:t>
       </w:r>
     </w:p>
     <w:p>
@@ -920,15 +920,15 @@
         <w:pStyle w:val="ListBullet"/>
       </w:pPr>
       <w:r>
-        <w:t>Los auxiliares y administradores ven el menú 'Administración' con accesos rápidos a Dashboard, Categorías, Subcategorías, Productos y Pedidos.</w:t>
-      </w:r>
-    </w:p>
-    <w:p>
-      <w:pPr>
-        <w:pStyle w:val="ListBullet"/>
-      </w:pPr>
-      <w:r>
-        <w:t>Los administradores ven en el menú de administración accesos adicionales a Usuarios y Cotizaciones.</w:t>
+        <w:t>Los auxiliares ven el menú 'Administración' con accesos a Dashboard, Pedidos, Categorías, Subcategorías, Productos y Soporte, pero con alcance limitado.</w:t>
+      </w:r>
+    </w:p>
+    <w:p>
+      <w:pPr>
+        <w:pStyle w:val="ListBullet"/>
+      </w:pPr>
+      <w:r>
+        <w:t>Los administradores ven además accesos a Usuarios y Cotizaciones para cubrir funciones de gestión completa.</w:t>
       </w:r>
     </w:p>
     <w:p>
@@ -1751,12 +1751,12 @@
         <w:pStyle w:val="Heading2"/>
       </w:pPr>
       <w:r>
-        <w:t>Dashboard administrativo</w:t>
-      </w:r>
-    </w:p>
-    <w:p>
-      <w:r>
-        <w:t>El dashboard ofrece una vista general del estado de la tienda y permite abrir rápidamente las funciones administrativas más importantes.</w:t>
+        <w:t>Dashboard administrativo (auxiliar)</w:t>
+      </w:r>
+    </w:p>
+    <w:p>
+      <w:r>
+        <w:t>El dashboard del auxiliar ofrece una vista general de las operaciones clave del negocio y accesos rápidos a tareas de apoyo, sin incluir funciones de administración completa.</w:t>
       </w:r>
     </w:p>
     <w:p>
@@ -1772,39 +1772,23 @@
         <w:pStyle w:val="ListBullet"/>
       </w:pPr>
       <w:r>
-        <w:t>Tarjetas principales de KPI para Productos, Pedidos, Usuarios, Ventas Totales, Categorías, Subcategorías, Cotizaciones y Soporte.</w:t>
-      </w:r>
-    </w:p>
-    <w:p>
-      <w:pPr>
-        <w:pStyle w:val="ListBullet"/>
-      </w:pPr>
-      <w:r>
-        <w:t>Clic en una tarjeta de KPI para ir directamente a la sección relacionada.</w:t>
-      </w:r>
-    </w:p>
-    <w:p>
-      <w:pPr>
-        <w:pStyle w:val="ListBullet"/>
-      </w:pPr>
-      <w:r>
-        <w:t>Sección 'Distribución de Pedidos' con resúmenes por estado y porcentaje del total.</w:t>
-      </w:r>
-    </w:p>
-    <w:p>
-      <w:pPr>
-        <w:pStyle w:val="ListBullet"/>
-      </w:pPr>
-      <w:r>
-        <w:t>Sección 'Actividad Reciente' con los últimos pedidos del sistema y acceso directo a 'Ver detalle'.</w:t>
-      </w:r>
-    </w:p>
-    <w:p>
-      <w:pPr>
-        <w:pStyle w:val="ListBullet"/>
-      </w:pPr>
-      <w:r>
-        <w:t>Sección 'Acciones Rápidas' con accesos a 'Nuevo Producto', 'Nueva Categoría', 'Subcategorías', 'Gestionar Pedidos', 'Nuevo Usuario' y 'Cotizaciones'.</w:t>
+        <w:t>Tarjetas de KPI centradas en pedidos, catálogo y soporte, con enfoque operativo.</w:t>
+      </w:r>
+    </w:p>
+    <w:p>
+      <w:pPr>
+        <w:pStyle w:val="ListBullet"/>
+      </w:pPr>
+      <w:r>
+        <w:t>Accesos directos para revisar pedidos, mantener categorías y productos básicos, y atender tickets.</w:t>
+      </w:r>
+    </w:p>
+    <w:p>
+      <w:pPr>
+        <w:pStyle w:val="ListBullet"/>
+      </w:pPr>
+      <w:r>
+        <w:t>No incluye gestión de usuarios ni cotizaciones; esas funciones quedan reservadas al administrador.</w:t>
       </w:r>
     </w:p>
     <w:p>
@@ -1817,7 +1801,7 @@
     </w:p>
     <w:p>
       <w:r>
-        <w:t>Permite revisar los pedidos, aplicar filtros y cambiar su estado desde una vista centralizada.</w:t>
+        <w:t>Permite revisar los pedidos, aplicar filtros y cambiar su estado desde una vista centralizada, dentro del alcance del rol de apoyo.</w:t>
       </w:r>
     </w:p>
     <w:p>
@@ -1833,14 +1817,6 @@
         <w:pStyle w:val="ListBullet"/>
       </w:pPr>
       <w:r>
-        <w:t>Botón 'Exportar' con menú desplegable para descargar en PDF o Excel los pedidos filtrados.</w:t>
-      </w:r>
-    </w:p>
-    <w:p>
-      <w:pPr>
-        <w:pStyle w:val="ListBullet"/>
-      </w:pPr>
-      <w:r>
         <w:t>Campo 'Buscar cliente' para localizar pedidos por nombre o correo del cliente.</w:t>
       </w:r>
     </w:p>
@@ -1857,7 +1833,7 @@
         <w:pStyle w:val="ListBullet"/>
       </w:pPr>
       <w:r>
-        <w:t>Botón 'Ver detalle' para abrir el modal con información completa del pedido y sus productos.</w:t>
+        <w:t>Botón 'Ver detalle' para abrir la información completa del pedido y sus productos.</w:t>
       </w:r>
     </w:p>
     <w:p>
@@ -1873,7 +1849,7 @@
         <w:pStyle w:val="ListBullet"/>
       </w:pPr>
       <w:r>
-        <w:t>En el modal de detalle se muestran también los botones de cambio de estado: 'Pendiente', 'En Proceso', 'Enviado', 'Entregado' y 'Cancelado'.</w:t>
+        <w:t>Se limita a seguimiento y actualización de estado; no puede eliminar pedidos ni administrar usuarios asociados.</w:t>
       </w:r>
     </w:p>
     <w:p>
@@ -1881,28 +1857,12 @@
         <w:pStyle w:val="Heading2"/>
       </w:pPr>
       <w:r>
-        <w:t>Gestión de categorías</w:t>
-      </w:r>
-    </w:p>
-    <w:p>
-      <w:r>
-        <w:t>La sección de categorías permite crear, editar, activar, desactivar y eliminar categorías del catálogo.</w:t>
-      </w:r>
-    </w:p>
-    <w:p>
-      <w:pPr>
-        <w:pStyle w:val="ListBullet"/>
-      </w:pPr>
-      <w:r>
-        <w:t>Botón 'Exportar' para generar un reporte en PDF o Excel de las categorías filtradas.</w:t>
-      </w:r>
-    </w:p>
-    <w:p>
-      <w:pPr>
-        <w:pStyle w:val="ListBullet"/>
-      </w:pPr>
-      <w:r>
-        <w:t>Menú de acción masiva con 'Activar todas' y 'Desactivar todas' para las categorías visibles con filtros.</w:t>
+        <w:t>Gestión limitada de categorías</w:t>
+      </w:r>
+    </w:p>
+    <w:p>
+      <w:r>
+        <w:t>La sección de categorías permite al auxiliar mantener el catálogo básico con permisos restringidos.</w:t>
       </w:r>
     </w:p>
     <w:p>
@@ -1918,31 +1878,31 @@
         <w:pStyle w:val="ListBullet"/>
       </w:pPr>
       <w:r>
-        <w:t>Botones 'Editar' en cada fila para modificar nombre, descripción y estado.</w:t>
-      </w:r>
-    </w:p>
-    <w:p>
-      <w:pPr>
-        <w:pStyle w:val="ListBullet"/>
-      </w:pPr>
-      <w:r>
-        <w:t>Botón 'Eliminar' para borrar una categoría con confirmación.</w:t>
-      </w:r>
-    </w:p>
-    <w:p>
-      <w:pPr>
-        <w:pStyle w:val="ListBullet"/>
-      </w:pPr>
-      <w:r>
-        <w:t>Botón 'Activar' o 'Desactivar' para cambiar el estado de cada categoría individualmente.</w:t>
-      </w:r>
-    </w:p>
-    <w:p>
-      <w:pPr>
-        <w:pStyle w:val="ListBullet"/>
-      </w:pPr>
-      <w:r>
-        <w:t>Filtros de búsqueda, estado y orden por nombre, además del botón 'Limpiar filtros'.</w:t>
+        <w:t>Botones 'Editar' para modificar nombre, descripción y estado.</w:t>
+      </w:r>
+    </w:p>
+    <w:p>
+      <w:pPr>
+        <w:pStyle w:val="ListBullet"/>
+      </w:pPr>
+      <w:r>
+        <w:t>Botón 'Activar' o 'Desactivar' para cambiar la disponibilidad de la categoría.</w:t>
+      </w:r>
+    </w:p>
+    <w:p>
+      <w:pPr>
+        <w:pStyle w:val="ListBullet"/>
+      </w:pPr>
+      <w:r>
+        <w:t>No se permite eliminar categorías; esa acción es exclusiva del administrador.</w:t>
+      </w:r>
+    </w:p>
+    <w:p>
+      <w:pPr>
+        <w:pStyle w:val="ListBullet"/>
+      </w:pPr>
+      <w:r>
+        <w:t>Los filtros de búsqueda y estado ayudan a localizar categorías de forma rápida.</w:t>
       </w:r>
     </w:p>
     <w:p>
@@ -1950,28 +1910,12 @@
         <w:pStyle w:val="Heading2"/>
       </w:pPr>
       <w:r>
-        <w:t>Gestión de subcategorías</w:t>
-      </w:r>
-    </w:p>
-    <w:p>
-      <w:r>
-        <w:t>La gestión de subcategorías controla la creación y organización de las subcategorías del catálogo.</w:t>
-      </w:r>
-    </w:p>
-    <w:p>
-      <w:pPr>
-        <w:pStyle w:val="ListBullet"/>
-      </w:pPr>
-      <w:r>
-        <w:t>Botón 'Exportar' para guardar la lista en PDF o Excel.</w:t>
-      </w:r>
-    </w:p>
-    <w:p>
-      <w:pPr>
-        <w:pStyle w:val="ListBullet"/>
-      </w:pPr>
-      <w:r>
-        <w:t>Menú de acción masiva con 'Activar todas' y 'Desactivar todas' para las subcategorías filtradas.</w:t>
+        <w:t>Gestión limitada de subcategorías</w:t>
+      </w:r>
+    </w:p>
+    <w:p>
+      <w:r>
+        <w:t>La gestión de subcategorías permite apoyar la organización del catálogo, sin acceso a operaciones críticas.</w:t>
       </w:r>
     </w:p>
     <w:p>
@@ -1995,23 +1939,23 @@
         <w:pStyle w:val="ListBullet"/>
       </w:pPr>
       <w:r>
-        <w:t>Botón 'Eliminar' para borrar la subcategoría con confirmación.</w:t>
-      </w:r>
-    </w:p>
-    <w:p>
-      <w:pPr>
-        <w:pStyle w:val="ListBullet"/>
-      </w:pPr>
-      <w:r>
-        <w:t>Botón 'Activar' o 'Desactivar' para cambiar el estado individualmente.</w:t>
-      </w:r>
-    </w:p>
-    <w:p>
-      <w:pPr>
-        <w:pStyle w:val="ListBullet"/>
-      </w:pPr>
-      <w:r>
-        <w:t>Filtros por búsqueda, categoría, estado y orden por nombre, con botón 'Limpiar'.</w:t>
+        <w:t>Botón 'Activar' o 'Desactivar' para cambiar el estado de la subcategoría.</w:t>
+      </w:r>
+    </w:p>
+    <w:p>
+      <w:pPr>
+        <w:pStyle w:val="ListBullet"/>
+      </w:pPr>
+      <w:r>
+        <w:t>No se permite eliminar subcategorías; esa tarea queda reservada al administrador.</w:t>
+      </w:r>
+    </w:p>
+    <w:p>
+      <w:pPr>
+        <w:pStyle w:val="ListBullet"/>
+      </w:pPr>
+      <w:r>
+        <w:t>Se pueden aplicar filtros por categoría y estado para encontrar registros fácilmente.</w:t>
       </w:r>
     </w:p>
     <w:p>
@@ -2019,20 +1963,12 @@
         <w:pStyle w:val="Heading2"/>
       </w:pPr>
       <w:r>
-        <w:t>Gestión de productos</w:t>
-      </w:r>
-    </w:p>
-    <w:p>
-      <w:r>
-        <w:t>La sección de productos permite crear, editar y controlar la disponibilidad de los artículos del catálogo.</w:t>
-      </w:r>
-    </w:p>
-    <w:p>
-      <w:pPr>
-        <w:pStyle w:val="ListBullet"/>
-      </w:pPr>
-      <w:r>
-        <w:t>Botón 'Exportar' para descargar un reporte de productos filtrados en PDF o Excel.</w:t>
+        <w:t>Gestión limitada de productos</w:t>
+      </w:r>
+    </w:p>
+    <w:p>
+      <w:r>
+        <w:t>La sección de productos permite al auxiliar actualizar información básica y disponibilidad del catálogo, sin permisos completos de administración.</w:t>
       </w:r>
     </w:p>
     <w:p>
@@ -2048,7 +1984,7 @@
         <w:pStyle w:val="ListBullet"/>
       </w:pPr>
       <w:r>
-        <w:t>Filtros por búsqueda, categoría, subcategoría, rango de precio y orden por nombre.</w:t>
+        <w:t>Filtros por búsqueda, categoría, subcategoría y rango de precio.</w:t>
       </w:r>
     </w:p>
     <w:p>
@@ -2064,14 +2000,6 @@
         <w:pStyle w:val="ListBullet"/>
       </w:pPr>
       <w:r>
-        <w:t>Botón 'Eliminar' para quitar un producto del catálogo.</w:t>
-      </w:r>
-    </w:p>
-    <w:p>
-      <w:pPr>
-        <w:pStyle w:val="ListBullet"/>
-      </w:pPr>
-      <w:r>
         <w:t>Botón 'Activar' o 'Desactivar' para cambiar la visibilidad del producto.</w:t>
       </w:r>
     </w:p>
@@ -2080,15 +2008,15 @@
         <w:pStyle w:val="ListBullet"/>
       </w:pPr>
       <w:r>
-        <w:t>Botón de acción masiva para activar o desactivar todos los productos filtrados.</w:t>
-      </w:r>
-    </w:p>
-    <w:p>
-      <w:pPr>
-        <w:pStyle w:val="ListBullet"/>
-      </w:pPr>
-      <w:r>
-        <w:t>Sección de 'Vista Previa' para adjuntar una imagen del producto desde el modal de edición o creación.</w:t>
+        <w:t>No se permite eliminar productos; esa acción solo la realiza el administrador.</w:t>
+      </w:r>
+    </w:p>
+    <w:p>
+      <w:pPr>
+        <w:pStyle w:val="ListBullet"/>
+      </w:pPr>
+      <w:r>
+        <w:t>La gestión está enfocada en mantener actualizado el inventario y el catálogo básico.</w:t>
       </w:r>
     </w:p>
     <w:p>
@@ -2096,12 +2024,12 @@
         <w:pStyle w:val="Heading2"/>
       </w:pPr>
       <w:r>
-        <w:t>Soporte</w:t>
-      </w:r>
-    </w:p>
-    <w:p>
-      <w:r>
-        <w:t>La sección de soporte permite revisar mensajes recibidos y responderlos desde la plataforma.</w:t>
+        <w:t>Soporte y atención</w:t>
+      </w:r>
+    </w:p>
+    <w:p>
+      <w:r>
+        <w:t>La sección de soporte permite revisar mensajes recibidos y responderlos desde la plataforma, dentro del alcance del rol de apoyo.</w:t>
       </w:r>
     </w:p>
     <w:p>
@@ -2141,7 +2069,7 @@
         <w:pStyle w:val="ListBullet"/>
       </w:pPr>
       <w:r>
-        <w:t>Cada mensaje puede tener estado 'Pendiente', 'Revisado', 'Respondido' o 'Cerrado'.</w:t>
+        <w:t>El auxiliar no gestiona usuarios ni cotizaciones; solo apoya la atención de soporte operativa.</w:t>
       </w:r>
     </w:p>
     <w:p>
@@ -2149,12 +2077,12 @@
         <w:pStyle w:val="Heading2"/>
       </w:pPr>
       <w:r>
-        <w:t>Dashboard administrativo</w:t>
-      </w:r>
-    </w:p>
-    <w:p>
-      <w:r>
-        <w:t>El dashboard ofrece una vista general de métricas clave y accesos rápidos a las secciones administrativas.</w:t>
+        <w:t>Dashboard administrativo (administrador)</w:t>
+      </w:r>
+    </w:p>
+    <w:p>
+      <w:r>
+        <w:t>El dashboard del administrador ofrece métricas completas y accesos a las secciones de gestión total del sistema.</w:t>
       </w:r>
     </w:p>
     <w:p>
@@ -2210,7 +2138,7 @@
         <w:pStyle w:val="ListBullet"/>
       </w:pPr>
       <w:r>
-        <w:t>Acciones rápidas disponibles para Nuevo Producto, Nueva Categoría, Subcategorías, Gestionar Pedidos y Cotizaciones.</w:t>
+        <w:t>Acciones rápidas disponibles para Nuevo Producto, Nueva Categoría, Subcategorías, Gestionar Pedidos, Usuarios y Cotizaciones.</w:t>
       </w:r>
     </w:p>
     <w:p>
@@ -2786,7 +2714,7 @@
           </w:tcPr>
           <w:p>
             <w:r>
-              <w:t>Apoyar tareas administrativas básicas y revisar operaciones</w:t>
+              <w:t>Revisar pedidos, mantener catálogo básico y atender soporte con permisos limitados</w:t>
             </w:r>
           </w:p>
         </w:tc>
@@ -2796,7 +2724,7 @@
           </w:tcPr>
           <w:p>
             <w:r>
-              <w:t>Tiene acceso de apoyo, pero no debe realizar cambios críticos</w:t>
+              <w:t>Tiene acceso de apoyo, pero no gestiona usuarios ni elimina registros</w:t>
             </w:r>
           </w:p>
         </w:tc>
@@ -2818,7 +2746,7 @@
           </w:tcPr>
           <w:p>
             <w:r>
-              <w:t>Gestionar productos, categorías, usuarios, pedidos y soporte</w:t>
+              <w:t>Gestionar productos, categorías, usuarios, pedidos, cotizaciones y soporte</w:t>
             </w:r>
           </w:p>
         </w:tc>

</xml_diff>